<commit_message>
Taahhütnameden tarih/yazar satırını kaldır
Co-Authored-By: Claude Opus 5.5 <noreply@anthropic.com>
Claude-Session: https://claude.ai/code/session_01GvvXYCvFRgcoF5U7FkNVWD
</commit_message>
<xml_diff>
--- a/Sozlesme_Gizlilik_Taahhutnamesi.docx
+++ b/Sozlesme_Gizlilik_Taahhutnamesi.docx
@@ -8,18 +8,6 @@
       </w:pPr>
       <w:r>
         <w:t xml:space="preserve">Sözleşme Örneği Teslim ve Gizlilik Taahhütnamesi</w:t>
-      </w:r>
-    </w:p>
-    <w:p>
-      <w:pPr/>
-      <w:r>
-        <w:t xml:space="preserve">Oct 7, 2026</w:t>
-      </w:r>
-      <w:r>
-        <w:t xml:space="preserve"> · </w:t>
-      </w:r>
-      <w:r>
-        <w:t xml:space="preserve">@İzgi Sultan  İnan</w:t>
       </w:r>
     </w:p>
     <w:p>

</xml_diff>